<commit_message>
Table create and insert queries, interacting queries complete
</commit_message>
<xml_diff>
--- a/deliverables/Relational Schema.docx
+++ b/deliverables/Relational Schema.docx
@@ -36,7 +36,7 @@
     <w:tbl>
       <w:tblPr>
         <w:tblStyle w:val="TableGrid"/>
-        <w:tblpPr w:leftFromText="180" w:rightFromText="180" w:vertAnchor="text" w:horzAnchor="margin" w:tblpY="302"/>
+        <w:tblpPr w:leftFromText="180" w:rightFromText="180" w:vertAnchor="text" w:horzAnchor="margin" w:tblpY="608"/>
         <w:tblW w:w="0" w:type="auto"/>
         <w:tblLook w:val="04A0" w:firstRow="1" w:lastRow="0" w:firstColumn="1" w:lastColumn="0" w:noHBand="0" w:noVBand="1"/>
       </w:tblPr>
@@ -139,6 +139,21 @@
         </w:tc>
       </w:tr>
     </w:tbl>
+    <w:p>
+      <w:pPr>
+        <w:rPr>
+          <w:b/>
+          <w:bCs/>
+        </w:rPr>
+      </w:pPr>
+      <w:r>
+        <w:rPr>
+          <w:b/>
+          <w:bCs/>
+        </w:rPr>
+        <w:t>Entities:</w:t>
+      </w:r>
+    </w:p>
     <w:p>
       <w:r>
         <w:t>Customer:</w:t>
@@ -224,10 +239,7 @@
           </w:tcPr>
           <w:p>
             <w:r>
-              <w:t>Shift</w:t>
-            </w:r>
-            <w:r>
-              <w:t xml:space="preserve"> </w:t>
+              <w:t xml:space="preserve">Shift </w:t>
             </w:r>
           </w:p>
         </w:tc>
@@ -396,13 +408,7 @@
           </w:tcPr>
           <w:p>
             <w:r>
-              <w:t>P</w:t>
-            </w:r>
-            <w:r>
-              <w:t>rice</w:t>
-            </w:r>
-            <w:r>
-              <w:t xml:space="preserve"> </w:t>
+              <w:t xml:space="preserve">Price </w:t>
             </w:r>
           </w:p>
         </w:tc>
@@ -509,6 +515,28 @@
       </w:tr>
     </w:tbl>
     <w:p>
+      <w:pPr>
+        <w:rPr>
+          <w:b/>
+          <w:bCs/>
+        </w:rPr>
+      </w:pPr>
+      <w:r>
+        <w:rPr>
+          <w:b/>
+          <w:bCs/>
+        </w:rPr>
+        <w:t>Relationships</w:t>
+      </w:r>
+      <w:r>
+        <w:rPr>
+          <w:b/>
+          <w:bCs/>
+        </w:rPr>
+        <w:t>:</w:t>
+      </w:r>
+    </w:p>
+    <w:p>
       <w:r>
         <w:t>Purchase Products:</w:t>
       </w:r>
@@ -565,14 +593,7 @@
                 <w:i/>
                 <w:iCs/>
               </w:rPr>
-              <w:t>Product Id</w:t>
-            </w:r>
-            <w:r>
-              <w:rPr>
-                <w:i/>
-                <w:iCs/>
-              </w:rPr>
-              <w:t xml:space="preserve"> </w:t>
+              <w:t xml:space="preserve">Product Id </w:t>
             </w:r>
           </w:p>
         </w:tc>

</xml_diff>